<commit_message>
Correct seat assignment: doctor=backrest chair (left), patient=round stool (right), no mirror
</commit_message>
<xml_diff>
--- a/Veo3_プロンプト_実物背景_女性医師.docx
+++ b/Veo3_プロンプト_実物背景_女性医師.docx
@@ -82,7 +82,7 @@
           <w:sz w:val="21"/>
           <w:szCs w:val="21"/>
         </w:rPr>
-        <w:t xml:space="preserve">医師：日本人・女性（she/her、白衣）。丸椅子（rolling stool）に座る。</w:t>
+        <w:t xml:space="preserve">医師：日本人・女性（she/her、白衣）。背もたれ椅子に座る。</w:t>
       </w:r>
     </w:p>
     <w:p>
@@ -100,7 +100,7 @@
           <w:sz w:val="21"/>
           <w:szCs w:val="21"/>
         </w:rPr>
-        <w:t xml:space="preserve">患者：ベトナム人男性。背もたれ椅子に座る。</w:t>
+        <w:t xml:space="preserve">患者：ベトナム人男性。丸椅子（rolling stool）に座る。</w:t>
       </w:r>
     </w:p>
     <w:p>
@@ -118,7 +118,7 @@
           <w:sz w:val="21"/>
           <w:szCs w:val="21"/>
         </w:rPr>
-        <w:t xml:space="preserve">配置：画面の【左＝医師】／【右＝患者】。</w:t>
+        <w:t xml:space="preserve">配置：画面の【左＝医師（背もたれ椅子）】／【右＝患者（丸椅子）】。</w:t>
       </w:r>
     </w:p>
     <w:p>
@@ -185,7 +185,7 @@
           <w:sz w:val="21"/>
           <w:szCs w:val="21"/>
         </w:rPr>
-        <w:t xml:space="preserve">実物写真では、白い丸椅子（医師用）が右・赤い背もたれ椅子（患者用）が左にあります。今回は【医師=左／患者=右】にしたいので、まず写真を左右反転（ミラー）してから使います。反転すると丸椅子が左・背もたれ椅子が右に来て、役割も自然なまま希望の配置になります。</w:t>
+        <w:t xml:space="preserve">実物写真では、背もたれ椅子（医師用）が左・白い丸椅子（患者用）が右にあります。これはそのまま【医師=左／患者=右】と一致するため、反転は不要。写真をそのまま使えます。</w:t>
       </w:r>
     </w:p>
     <w:p>
@@ -203,25 +203,7 @@
           <w:sz w:val="21"/>
           <w:szCs w:val="21"/>
         </w:rPr>
-        <w:t xml:space="preserve">反転方法：スマホの写真アプリ→編集→反転（ミラー）で1タップ。または Gemini に『この写真を左右反転して』と依頼。</w:t>
-      </w:r>
-    </w:p>
-    <w:p>
-      <w:pPr>
-        <w:pStyle w:val="ListParagraph"/>
-        <w:numPr>
-          <w:ilvl w:val="0"/>
-          <w:numId w:val="2"/>
-        </w:numPr>
-        <w:spacing w:after="70" w:line="316"/>
-      </w:pPr>
-      <w:r>
-        <w:rPr>
-          <w:rFonts w:ascii="Yu Gothic" w:cs="Yu Gothic" w:eastAsia="Yu Gothic" w:hAnsi="Yu Gothic"/>
-          <w:sz w:val="21"/>
-          <w:szCs w:val="21"/>
-        </w:rPr>
-        <w:t xml:space="preserve">反転した写真を、下のキーフレーム作成でGeminiに読み込ませ、人物を合成する（部屋はそのまま実物）。</w:t>
+        <w:t xml:space="preserve">写真はそのままGeminiに読み込ませ、下のキーフレーム作成で人物を合成する（部屋は実物のまま）。</w:t>
       </w:r>
     </w:p>
     <w:p>
@@ -257,7 +239,7 @@
           <w:sz w:val="21"/>
           <w:szCs w:val="21"/>
         </w:rPr>
-        <w:t xml:space="preserve">以降のプロンプトの『the attached real clinic room photo』は、この反転済み写真を指します。</w:t>
+        <w:t xml:space="preserve">以降のプロンプトの『the attached real clinic room photo』は、この実物写真（そのまま）を指します。</w:t>
       </w:r>
     </w:p>
     <w:p>
@@ -288,7 +270,7 @@
           <w:sz w:val="21"/>
           <w:szCs w:val="21"/>
         </w:rPr>
-        <w:t xml:space="preserve">左右は【画面左＝医師（丸椅子）／画面右＝患者（背もたれ椅子）】で固定。</w:t>
+        <w:t xml:space="preserve">左右は【画面左＝医師（背もたれ椅子）／画面右＝患者（丸椅子）】で固定。</w:t>
       </w:r>
     </w:p>
     <w:p>
@@ -306,7 +288,7 @@
           <w:sz w:val="21"/>
           <w:szCs w:val="21"/>
         </w:rPr>
-        <w:t xml:space="preserve">医師の単独ショット：医師は画面左、右（患者方向）を向く。相手（患者）の椅子は空のまま写す。</w:t>
+        <w:t xml:space="preserve">医師の単独ショット：医師は画面左、右（患者方向）を向く。相手（患者）の丸椅子は空のまま写す。</w:t>
       </w:r>
     </w:p>
     <w:p>
@@ -324,7 +306,7 @@
           <w:sz w:val="21"/>
           <w:szCs w:val="21"/>
         </w:rPr>
-        <w:t xml:space="preserve">患者の単独ショット：患者は画面右、左（医師方向）を向く。相手（医師）の丸椅子は空のまま写す。</w:t>
+        <w:t xml:space="preserve">患者の単独ショット：患者は画面右、左（医師方向）を向く。相手（医師）の背もたれ椅子は空のまま写す。</w:t>
       </w:r>
     </w:p>
     <w:p>
@@ -515,7 +497,7 @@
           <w:sz w:val="21"/>
           <w:szCs w:val="21"/>
         </w:rPr>
-        <w:t xml:space="preserve">合成の部屋プロンプトは不要です。あなたの実際の診察室写真（左右反転済み）をそのまま背景に使います。下のキーフレーム作成で、この写真に人物を合成します。</w:t>
+        <w:t xml:space="preserve">合成の部屋プロンプトは不要です。あなたの実際の診察室写真を、そのまま（反転せず）背景に使います。下のキーフレーム作成で、この写真に人物を合成します。</w:t>
       </w:r>
     </w:p>
     <w:tbl>
@@ -560,7 +542,7 @@
                 <w:sz w:val="19"/>
                 <w:szCs w:val="19"/>
               </w:rPr>
-              <w:t xml:space="preserve">（合成不要）Use your OWN real clinic room photo, mirrored horizontally so the round rolling stool is on the LEFT and the backrest chair is on the RIGHT. Keep the real desk, PC monitor, printer, wall panel and door exactly as in the photo.</w:t>
+              <w:t xml:space="preserve">（合成不要）Use your OWN real clinic room photo AS IS (no mirroring). In this photo the doctor's chair (with backrest) is on the LEFT and the patient's round stool is on the RIGHT — which already matches doctor-left / patient-right. Keep the real desk, PC monitor, printer, wall panel and door exactly as in the photo.</w:t>
             </w:r>
           </w:p>
         </w:tc>
@@ -658,7 +640,7 @@
                 <w:sz w:val="19"/>
                 <w:szCs w:val="19"/>
               </w:rPr>
-              <w:t xml:space="preserve">Using the attached real clinic room photo (mirrored) AND the female doctor reference image, compose a photorealistic still that keeps the REAL room exactly (same desk, PC monitor, printer, wall panel, door). Place the SAME Japanese female doctor seated on the round rolling stool on the LEFT, her body angled about 90 degrees toward the EMPTY backrest patient chair at the corner of the desk on the right. She is turned to face the empty patient seat, looking screen-RIGHT. Only ONE person (the doctor); the patient chair is clearly EMPTY. Medium shot, soft daylight, 16:9. No other person, no back of head, no text, no watermark.</w:t>
+              <w:t xml:space="preserve">Using the attached real clinic room photo (AS IS, no mirroring) AND the female doctor reference image, compose a photorealistic still that keeps the REAL room exactly (same desk, PC monitor, printer, wall panel, door). Place the SAME Japanese female doctor seated on the CHAIR WITH A BACKREST on the LEFT, her body angled about 90 degrees toward the EMPTY round stool at the corner of the desk on the right. She is turned to face the empty patient seat, looking screen-RIGHT. Only ONE person (the doctor); the patient's round stool is clearly EMPTY. Medium shot, soft daylight, 16:9. No other person, no back of head, no text, no watermark.</w:t>
             </w:r>
           </w:p>
         </w:tc>
@@ -722,7 +704,7 @@
                 <w:sz w:val="19"/>
                 <w:szCs w:val="19"/>
               </w:rPr>
-              <w:t xml:space="preserve">Using the attached real clinic room photo (mirrored) AND the patient reference image, compose a photorealistic still that keeps the REAL room exactly. Place the SAME 25-year-old Vietnamese man seated on the backrest patient chair on the RIGHT, his body angled about 90 degrees toward the EMPTY round rolling stool on the left. He is turned to face the empty doctor seat, looking screen-LEFT. Only ONE person (the patient); the round stool is clearly EMPTY. Close-up, soft daylight, 16:9. No other person, no back of head, no text, no watermark.</w:t>
+              <w:t xml:space="preserve">Using the attached real clinic room photo (AS IS, no mirroring) AND the patient reference image, compose a photorealistic still that keeps the REAL room exactly. Place the SAME 25-year-old Vietnamese man seated on the ROUND STOOL on the RIGHT, his body angled about 90 degrees toward the EMPTY chair with a backrest on the left. He is turned to face the empty doctor seat, looking screen-LEFT. Only ONE person (the patient); the doctor's backrest chair is clearly EMPTY. Close-up, soft daylight, 16:9. No other person, no back of head, no text, no watermark.</w:t>
             </w:r>
           </w:p>
         </w:tc>
@@ -786,7 +768,7 @@
                 <w:sz w:val="19"/>
                 <w:szCs w:val="19"/>
               </w:rPr>
-              <w:t xml:space="preserve">Using the attached real clinic room photo (mirrored) AND both character references, compose a single photorealistic still that keeps the REAL room exactly. Place the Japanese female doctor seated on the round stool on the LEFT and the 25-year-old Vietnamese man seated on the backrest chair on the RIGHT, at 90 degrees to each other at the corner of the desk. Both faces exactly match their references. Exactly TWO people, no third person. Wide two-shot showing the 90-degree layout, soft daylight, 16:9. No text, no watermark.</w:t>
+              <w:t xml:space="preserve">Using the attached real clinic room photo (AS IS, no mirroring) AND both character references, compose a single photorealistic still that keeps the REAL room exactly. Place the Japanese female doctor seated on the CHAIR WITH A BACKREST on the LEFT and the 25-year-old Vietnamese man seated on the ROUND STOOL on the RIGHT, at 90 degrees to each other at the corner of the desk. Both faces exactly match their references. Exactly TWO people, no third person. Wide two-shot showing the 90-degree layout, soft daylight, 16:9. No text, no watermark.</w:t>
             </w:r>
           </w:p>
         </w:tc>
@@ -1111,7 +1093,7 @@
                 <w:sz w:val="19"/>
                 <w:szCs w:val="19"/>
               </w:rPr>
-              <w:t xml:space="preserve">IMAGE-TO-VIDEO. Use the attached SINGLE-PERSON keyframe of the FEMALE doctor as the exact first frame (she is seated at the desk, turned about 90 degrees toward the empty patient chair, Japanese corner-seating layout). Animate ONLY this doctor speaking; keep the composition and 90-degree seating identical to the frame.</w:t>
+              <w:t xml:space="preserve">IMAGE-TO-VIDEO. Use the attached SINGLE-PERSON keyframe of the FEMALE doctor as the exact first frame (she is on the LEFT, seated on the chair with a backrest, turned about 90 degrees toward the empty patient stool on the right, Japanese corner-seating layout). Animate ONLY this doctor speaking; keep the composition and 90-degree seating identical to the frame.</w:t>
             </w:r>
           </w:p>
           <w:p>
@@ -1392,7 +1374,7 @@
                 <w:sz w:val="19"/>
                 <w:szCs w:val="19"/>
               </w:rPr>
-              <w:t xml:space="preserve">IMAGE-TO-VIDEO. Use the attached SINGLE-PERSON keyframe of the patient as the exact first frame (he is seated in the corner chair, turned about 90 degrees toward the empty doctor's stool, Japanese corner-seating layout). Animate ONLY this patient speaking; keep the composition and 90-degree seating identical to the frame.</w:t>
+              <w:t xml:space="preserve">IMAGE-TO-VIDEO. Use the attached SINGLE-PERSON keyframe of the patient as the exact first frame (he is on the RIGHT, seated on the round stool, turned about 90 degrees toward the empty doctor's backrest chair on the left, Japanese corner-seating layout). Animate ONLY this patient speaking; keep the composition and 90-degree seating identical to the frame.</w:t>
             </w:r>
           </w:p>
           <w:p>
@@ -1673,7 +1655,7 @@
                 <w:sz w:val="19"/>
                 <w:szCs w:val="19"/>
               </w:rPr>
-              <w:t xml:space="preserve">IMAGE-TO-VIDEO. Use the attached SINGLE-PERSON keyframe of the FEMALE doctor as the exact first frame (she is seated at the desk, turned about 90 degrees toward the empty patient chair, Japanese corner-seating layout). Animate ONLY this doctor speaking; keep the composition and 90-degree seating identical to the frame.</w:t>
+              <w:t xml:space="preserve">IMAGE-TO-VIDEO. Use the attached SINGLE-PERSON keyframe of the FEMALE doctor as the exact first frame (she is on the LEFT, seated on the chair with a backrest, turned about 90 degrees toward the empty patient stool on the right, Japanese corner-seating layout). Animate ONLY this doctor speaking; keep the composition and 90-degree seating identical to the frame.</w:t>
             </w:r>
           </w:p>
           <w:p>
@@ -1954,7 +1936,7 @@
                 <w:sz w:val="19"/>
                 <w:szCs w:val="19"/>
               </w:rPr>
-              <w:t xml:space="preserve">IMAGE-TO-VIDEO. Use the attached SINGLE-PERSON keyframe of the patient as the exact first frame (he is seated in the corner chair, turned about 90 degrees toward the empty doctor's stool, Japanese corner-seating layout). Animate ONLY this patient speaking; keep the composition and 90-degree seating identical to the frame.</w:t>
+              <w:t xml:space="preserve">IMAGE-TO-VIDEO. Use the attached SINGLE-PERSON keyframe of the patient as the exact first frame (he is on the RIGHT, seated on the round stool, turned about 90 degrees toward the empty doctor's backrest chair on the left, Japanese corner-seating layout). Animate ONLY this patient speaking; keep the composition and 90-degree seating identical to the frame.</w:t>
             </w:r>
           </w:p>
           <w:p>
@@ -2240,7 +2222,7 @@
                 <w:sz w:val="19"/>
                 <w:szCs w:val="19"/>
               </w:rPr>
-              <w:t xml:space="preserve">IMAGE-TO-VIDEO. Use the attached SINGLE-PERSON keyframe of the FEMALE doctor as the exact first frame (she is seated at the desk, turned about 90 degrees toward the empty patient chair, Japanese corner-seating layout). Animate ONLY this doctor speaking; keep the composition and 90-degree seating identical to the frame.</w:t>
+              <w:t xml:space="preserve">IMAGE-TO-VIDEO. Use the attached SINGLE-PERSON keyframe of the FEMALE doctor as the exact first frame (she is on the LEFT, seated on the chair with a backrest, turned about 90 degrees toward the empty patient stool on the right, Japanese corner-seating layout). Animate ONLY this doctor speaking; keep the composition and 90-degree seating identical to the frame.</w:t>
             </w:r>
           </w:p>
           <w:p>
@@ -2521,7 +2503,7 @@
                 <w:sz w:val="19"/>
                 <w:szCs w:val="19"/>
               </w:rPr>
-              <w:t xml:space="preserve">IMAGE-TO-VIDEO. Use the attached SINGLE-PERSON keyframe of the patient as the exact first frame (he is seated in the corner chair, turned about 90 degrees toward the empty doctor's stool, Japanese corner-seating layout). Animate ONLY this patient speaking; keep the composition and 90-degree seating identical to the frame.</w:t>
+              <w:t xml:space="preserve">IMAGE-TO-VIDEO. Use the attached SINGLE-PERSON keyframe of the patient as the exact first frame (he is on the RIGHT, seated on the round stool, turned about 90 degrees toward the empty doctor's backrest chair on the left, Japanese corner-seating layout). Animate ONLY this patient speaking; keep the composition and 90-degree seating identical to the frame.</w:t>
             </w:r>
           </w:p>
           <w:p>
@@ -2802,7 +2784,7 @@
                 <w:sz w:val="19"/>
                 <w:szCs w:val="19"/>
               </w:rPr>
-              <w:t xml:space="preserve">IMAGE-TO-VIDEO. Use the attached SINGLE-PERSON keyframe of the FEMALE doctor as the exact first frame (she is seated at the desk, turned about 90 degrees toward the empty patient chair, Japanese corner-seating layout). Animate ONLY this doctor speaking; keep the composition and 90-degree seating identical to the frame.</w:t>
+              <w:t xml:space="preserve">IMAGE-TO-VIDEO. Use the attached SINGLE-PERSON keyframe of the FEMALE doctor as the exact first frame (she is on the LEFT, seated on the chair with a backrest, turned about 90 degrees toward the empty patient stool on the right, Japanese corner-seating layout). Animate ONLY this doctor speaking; keep the composition and 90-degree seating identical to the frame.</w:t>
             </w:r>
           </w:p>
           <w:p>
@@ -3083,7 +3065,7 @@
                 <w:sz w:val="19"/>
                 <w:szCs w:val="19"/>
               </w:rPr>
-              <w:t xml:space="preserve">IMAGE-TO-VIDEO. Use the attached SINGLE-PERSON keyframe of the patient as the exact first frame (he is seated in the corner chair, turned about 90 degrees toward the empty doctor's stool, Japanese corner-seating layout). Animate ONLY this patient speaking; keep the composition and 90-degree seating identical to the frame.</w:t>
+              <w:t xml:space="preserve">IMAGE-TO-VIDEO. Use the attached SINGLE-PERSON keyframe of the patient as the exact first frame (he is on the RIGHT, seated on the round stool, turned about 90 degrees toward the empty doctor's backrest chair on the left, Japanese corner-seating layout). Animate ONLY this patient speaking; keep the composition and 90-degree seating identical to the frame.</w:t>
             </w:r>
           </w:p>
           <w:p>
@@ -3369,7 +3351,7 @@
                 <w:sz w:val="19"/>
                 <w:szCs w:val="19"/>
               </w:rPr>
-              <w:t xml:space="preserve">IMAGE-TO-VIDEO. Use the attached SINGLE-PERSON keyframe of the FEMALE doctor as the exact first frame (she is seated at the desk, turned about 90 degrees toward the empty patient chair, Japanese corner-seating layout). Animate ONLY this doctor speaking; keep the composition and 90-degree seating identical to the frame.</w:t>
+              <w:t xml:space="preserve">IMAGE-TO-VIDEO. Use the attached SINGLE-PERSON keyframe of the FEMALE doctor as the exact first frame (she is on the LEFT, seated on the chair with a backrest, turned about 90 degrees toward the empty patient stool on the right, Japanese corner-seating layout). Animate ONLY this doctor speaking; keep the composition and 90-degree seating identical to the frame.</w:t>
             </w:r>
           </w:p>
           <w:p>
@@ -3650,7 +3632,7 @@
                 <w:sz w:val="19"/>
                 <w:szCs w:val="19"/>
               </w:rPr>
-              <w:t xml:space="preserve">IMAGE-TO-VIDEO. Use the attached SINGLE-PERSON keyframe of the patient as the exact first frame (he is seated in the corner chair, turned about 90 degrees toward the empty doctor's stool, Japanese corner-seating layout). Animate ONLY this patient speaking; keep the composition and 90-degree seating identical to the frame.</w:t>
+              <w:t xml:space="preserve">IMAGE-TO-VIDEO. Use the attached SINGLE-PERSON keyframe of the patient as the exact first frame (he is on the RIGHT, seated on the round stool, turned about 90 degrees toward the empty doctor's backrest chair on the left, Japanese corner-seating layout). Animate ONLY this patient speaking; keep the composition and 90-degree seating identical to the frame.</w:t>
             </w:r>
           </w:p>
           <w:p>
@@ -3931,7 +3913,7 @@
                 <w:sz w:val="19"/>
                 <w:szCs w:val="19"/>
               </w:rPr>
-              <w:t xml:space="preserve">IMAGE-TO-VIDEO. Use the attached SINGLE-PERSON keyframe of the FEMALE doctor as the exact first frame (she is seated at the desk, turned about 90 degrees toward the empty patient chair, Japanese corner-seating layout). Animate ONLY this doctor speaking; keep the composition and 90-degree seating identical to the frame.</w:t>
+              <w:t xml:space="preserve">IMAGE-TO-VIDEO. Use the attached SINGLE-PERSON keyframe of the FEMALE doctor as the exact first frame (she is on the LEFT, seated on the chair with a backrest, turned about 90 degrees toward the empty patient stool on the right, Japanese corner-seating layout). Animate ONLY this doctor speaking; keep the composition and 90-degree seating identical to the frame.</w:t>
             </w:r>
           </w:p>
           <w:p>
@@ -4212,7 +4194,7 @@
                 <w:sz w:val="19"/>
                 <w:szCs w:val="19"/>
               </w:rPr>
-              <w:t xml:space="preserve">IMAGE-TO-VIDEO. Use the attached SINGLE-PERSON keyframe of the patient as the exact first frame (he is seated in the corner chair, turned about 90 degrees toward the empty doctor's stool, Japanese corner-seating layout). Animate ONLY this patient speaking; keep the composition and 90-degree seating identical to the frame.</w:t>
+              <w:t xml:space="preserve">IMAGE-TO-VIDEO. Use the attached SINGLE-PERSON keyframe of the patient as the exact first frame (he is on the RIGHT, seated on the round stool, turned about 90 degrees toward the empty doctor's backrest chair on the left, Japanese corner-seating layout). Animate ONLY this patient speaking; keep the composition and 90-degree seating identical to the frame.</w:t>
             </w:r>
           </w:p>
           <w:p>
@@ -4498,7 +4480,7 @@
                 <w:sz w:val="19"/>
                 <w:szCs w:val="19"/>
               </w:rPr>
-              <w:t xml:space="preserve">IMAGE-TO-VIDEO. Use the attached SINGLE-PERSON keyframe of the FEMALE doctor as the exact first frame (she is seated at the desk, turned about 90 degrees toward the empty patient chair, Japanese corner-seating layout). Animate ONLY this doctor speaking; keep the composition and 90-degree seating identical to the frame.</w:t>
+              <w:t xml:space="preserve">IMAGE-TO-VIDEO. Use the attached SINGLE-PERSON keyframe of the FEMALE doctor as the exact first frame (she is on the LEFT, seated on the chair with a backrest, turned about 90 degrees toward the empty patient stool on the right, Japanese corner-seating layout). Animate ONLY this doctor speaking; keep the composition and 90-degree seating identical to the frame.</w:t>
             </w:r>
           </w:p>
           <w:p>
@@ -4779,7 +4761,7 @@
                 <w:sz w:val="19"/>
                 <w:szCs w:val="19"/>
               </w:rPr>
-              <w:t xml:space="preserve">IMAGE-TO-VIDEO. Use the attached SINGLE-PERSON keyframe of the patient as the exact first frame (he is seated in the corner chair, turned about 90 degrees toward the empty doctor's stool, Japanese corner-seating layout). Animate ONLY this patient speaking; keep the composition and 90-degree seating identical to the frame.</w:t>
+              <w:t xml:space="preserve">IMAGE-TO-VIDEO. Use the attached SINGLE-PERSON keyframe of the patient as the exact first frame (he is on the RIGHT, seated on the round stool, turned about 90 degrees toward the empty doctor's backrest chair on the left, Japanese corner-seating layout). Animate ONLY this patient speaking; keep the composition and 90-degree seating identical to the frame.</w:t>
             </w:r>
           </w:p>
           <w:p>
@@ -5060,7 +5042,7 @@
                 <w:sz w:val="19"/>
                 <w:szCs w:val="19"/>
               </w:rPr>
-              <w:t xml:space="preserve">IMAGE-TO-VIDEO. Use the attached SINGLE-PERSON keyframe of the FEMALE doctor as the exact first frame (she is seated at the desk, turned about 90 degrees toward the empty patient chair, Japanese corner-seating layout). Animate ONLY this doctor speaking; keep the composition and 90-degree seating identical to the frame.</w:t>
+              <w:t xml:space="preserve">IMAGE-TO-VIDEO. Use the attached SINGLE-PERSON keyframe of the FEMALE doctor as the exact first frame (she is on the LEFT, seated on the chair with a backrest, turned about 90 degrees toward the empty patient stool on the right, Japanese corner-seating layout). Animate ONLY this doctor speaking; keep the composition and 90-degree seating identical to the frame.</w:t>
             </w:r>
           </w:p>
           <w:p>
@@ -5341,7 +5323,7 @@
                 <w:sz w:val="19"/>
                 <w:szCs w:val="19"/>
               </w:rPr>
-              <w:t xml:space="preserve">IMAGE-TO-VIDEO. Use the attached SINGLE-PERSON keyframe of the FEMALE doctor as the exact first frame (she is seated at the desk, turned about 90 degrees toward the empty patient chair, Japanese corner-seating layout). Animate ONLY this doctor speaking; keep the composition and 90-degree seating identical to the frame.</w:t>
+              <w:t xml:space="preserve">IMAGE-TO-VIDEO. Use the attached SINGLE-PERSON keyframe of the FEMALE doctor as the exact first frame (she is on the LEFT, seated on the chair with a backrest, turned about 90 degrees toward the empty patient stool on the right, Japanese corner-seating layout). Animate ONLY this doctor speaking; keep the composition and 90-degree seating identical to the frame.</w:t>
             </w:r>
           </w:p>
           <w:p>
@@ -5627,7 +5609,7 @@
                 <w:sz w:val="19"/>
                 <w:szCs w:val="19"/>
               </w:rPr>
-              <w:t xml:space="preserve">IMAGE-TO-VIDEO. Use the attached SINGLE-PERSON keyframe of the patient as the exact first frame (he is seated in the corner chair, turned about 90 degrees toward the empty doctor's stool, Japanese corner-seating layout). Animate ONLY this patient speaking; keep the composition and 90-degree seating identical to the frame.</w:t>
+              <w:t xml:space="preserve">IMAGE-TO-VIDEO. Use the attached SINGLE-PERSON keyframe of the patient as the exact first frame (he is on the RIGHT, seated on the round stool, turned about 90 degrees toward the empty doctor's backrest chair on the left, Japanese corner-seating layout). Animate ONLY this patient speaking; keep the composition and 90-degree seating identical to the frame.</w:t>
             </w:r>
           </w:p>
           <w:p>
@@ -5908,7 +5890,7 @@
                 <w:sz w:val="19"/>
                 <w:szCs w:val="19"/>
               </w:rPr>
-              <w:t xml:space="preserve">IMAGE-TO-VIDEO. Use the attached SINGLE-PERSON keyframe of the FEMALE doctor as the exact first frame (she is seated at the desk, turned about 90 degrees toward the empty patient chair, Japanese corner-seating layout). Animate ONLY this doctor speaking; keep the composition and 90-degree seating identical to the frame.</w:t>
+              <w:t xml:space="preserve">IMAGE-TO-VIDEO. Use the attached SINGLE-PERSON keyframe of the FEMALE doctor as the exact first frame (she is on the LEFT, seated on the chair with a backrest, turned about 90 degrees toward the empty patient stool on the right, Japanese corner-seating layout). Animate ONLY this doctor speaking; keep the composition and 90-degree seating identical to the frame.</w:t>
             </w:r>
           </w:p>
           <w:p>
@@ -6189,7 +6171,7 @@
                 <w:sz w:val="19"/>
                 <w:szCs w:val="19"/>
               </w:rPr>
-              <w:t xml:space="preserve">IMAGE-TO-VIDEO. Use the attached SINGLE-PERSON keyframe of the FEMALE doctor as the exact first frame (she is seated at the desk, turned about 90 degrees toward the empty patient chair, Japanese corner-seating layout). Animate ONLY this doctor speaking; keep the composition and 90-degree seating identical to the frame.</w:t>
+              <w:t xml:space="preserve">IMAGE-TO-VIDEO. Use the attached SINGLE-PERSON keyframe of the FEMALE doctor as the exact first frame (she is on the LEFT, seated on the chair with a backrest, turned about 90 degrees toward the empty patient stool on the right, Japanese corner-seating layout). Animate ONLY this doctor speaking; keep the composition and 90-degree seating identical to the frame.</w:t>
             </w:r>
           </w:p>
           <w:p>
@@ -6470,7 +6452,7 @@
                 <w:sz w:val="19"/>
                 <w:szCs w:val="19"/>
               </w:rPr>
-              <w:t xml:space="preserve">IMAGE-TO-VIDEO. Use the attached SINGLE-PERSON keyframe of the patient as the exact first frame (he is seated in the corner chair, turned about 90 degrees toward the empty doctor's stool, Japanese corner-seating layout). Animate ONLY this patient speaking; keep the composition and 90-degree seating identical to the frame.</w:t>
+              <w:t xml:space="preserve">IMAGE-TO-VIDEO. Use the attached SINGLE-PERSON keyframe of the patient as the exact first frame (he is on the RIGHT, seated on the round stool, turned about 90 degrees toward the empty doctor's backrest chair on the left, Japanese corner-seating layout). Animate ONLY this patient speaking; keep the composition and 90-degree seating identical to the frame.</w:t>
             </w:r>
           </w:p>
           <w:p>
@@ -6756,7 +6738,7 @@
                 <w:sz w:val="19"/>
                 <w:szCs w:val="19"/>
               </w:rPr>
-              <w:t xml:space="preserve">IMAGE-TO-VIDEO. Use the attached SINGLE-PERSON keyframe of the FEMALE doctor as the exact first frame (she is seated at the desk, turned about 90 degrees toward the empty patient chair, Japanese corner-seating layout). Animate ONLY this doctor speaking; keep the composition and 90-degree seating identical to the frame.</w:t>
+              <w:t xml:space="preserve">IMAGE-TO-VIDEO. Use the attached SINGLE-PERSON keyframe of the FEMALE doctor as the exact first frame (she is on the LEFT, seated on the chair with a backrest, turned about 90 degrees toward the empty patient stool on the right, Japanese corner-seating layout). Animate ONLY this doctor speaking; keep the composition and 90-degree seating identical to the frame.</w:t>
             </w:r>
           </w:p>
           <w:p>
@@ -7253,7 +7235,7 @@
                 <w:sz w:val="19"/>
                 <w:szCs w:val="19"/>
               </w:rPr>
-              <w:t xml:space="preserve">IMAGE-TO-VIDEO. Use the attached SINGLE-PERSON keyframe of the FEMALE doctor as the exact first frame (she is seated at the desk, turned about 90 degrees toward the empty patient chair, Japanese corner-seating layout). Animate ONLY this doctor speaking; keep the composition and 90-degree seating identical to the frame.</w:t>
+              <w:t xml:space="preserve">IMAGE-TO-VIDEO. Use the attached SINGLE-PERSON keyframe of the FEMALE doctor as the exact first frame (she is on the LEFT, seated on the chair with a backrest, turned about 90 degrees toward the empty patient stool on the right, Japanese corner-seating layout). Animate ONLY this doctor speaking; keep the composition and 90-degree seating identical to the frame.</w:t>
             </w:r>
           </w:p>
           <w:p>
@@ -7534,7 +7516,7 @@
                 <w:sz w:val="19"/>
                 <w:szCs w:val="19"/>
               </w:rPr>
-              <w:t xml:space="preserve">IMAGE-TO-VIDEO. Use the attached SINGLE-PERSON keyframe of the FEMALE doctor as the exact first frame (she is seated at the desk, turned about 90 degrees toward the empty patient chair, Japanese corner-seating layout). Animate ONLY this doctor speaking; keep the composition and 90-degree seating identical to the frame.</w:t>
+              <w:t xml:space="preserve">IMAGE-TO-VIDEO. Use the attached SINGLE-PERSON keyframe of the FEMALE doctor as the exact first frame (she is on the LEFT, seated on the chair with a backrest, turned about 90 degrees toward the empty patient stool on the right, Japanese corner-seating layout). Animate ONLY this doctor speaking; keep the composition and 90-degree seating identical to the frame.</w:t>
             </w:r>
           </w:p>
           <w:p>
@@ -7820,7 +7802,7 @@
                 <w:sz w:val="19"/>
                 <w:szCs w:val="19"/>
               </w:rPr>
-              <w:t xml:space="preserve">IMAGE-TO-VIDEO. Use the attached SINGLE-PERSON keyframe of the FEMALE doctor as the exact first frame (she is seated at the desk, turned about 90 degrees toward the empty patient chair, Japanese corner-seating layout). Animate ONLY this doctor speaking; keep the composition and 90-degree seating identical to the frame.</w:t>
+              <w:t xml:space="preserve">IMAGE-TO-VIDEO. Use the attached SINGLE-PERSON keyframe of the FEMALE doctor as the exact first frame (she is on the LEFT, seated on the chair with a backrest, turned about 90 degrees toward the empty patient stool on the right, Japanese corner-seating layout). Animate ONLY this doctor speaking; keep the composition and 90-degree seating identical to the frame.</w:t>
             </w:r>
           </w:p>
           <w:p>
@@ -8101,7 +8083,7 @@
                 <w:sz w:val="19"/>
                 <w:szCs w:val="19"/>
               </w:rPr>
-              <w:t xml:space="preserve">IMAGE-TO-VIDEO. Use the attached SINGLE-PERSON keyframe of the patient as the exact first frame (he is seated in the corner chair, turned about 90 degrees toward the empty doctor's stool, Japanese corner-seating layout). Animate ONLY this patient speaking; keep the composition and 90-degree seating identical to the frame.</w:t>
+              <w:t xml:space="preserve">IMAGE-TO-VIDEO. Use the attached SINGLE-PERSON keyframe of the patient as the exact first frame (he is on the RIGHT, seated on the round stool, turned about 90 degrees toward the empty doctor's backrest chair on the left, Japanese corner-seating layout). Animate ONLY this patient speaking; keep the composition and 90-degree seating identical to the frame.</w:t>
             </w:r>
           </w:p>
           <w:p>
@@ -8382,7 +8364,7 @@
                 <w:sz w:val="19"/>
                 <w:szCs w:val="19"/>
               </w:rPr>
-              <w:t xml:space="preserve">IMAGE-TO-VIDEO. Use the attached SINGLE-PERSON keyframe of the FEMALE doctor as the exact first frame (she is seated at the desk, turned about 90 degrees toward the empty patient chair, Japanese corner-seating layout). Animate ONLY this doctor speaking; keep the composition and 90-degree seating identical to the frame.</w:t>
+              <w:t xml:space="preserve">IMAGE-TO-VIDEO. Use the attached SINGLE-PERSON keyframe of the FEMALE doctor as the exact first frame (she is on the LEFT, seated on the chair with a backrest, turned about 90 degrees toward the empty patient stool on the right, Japanese corner-seating layout). Animate ONLY this doctor speaking; keep the composition and 90-degree seating identical to the frame.</w:t>
             </w:r>
           </w:p>
           <w:p>
@@ -8663,7 +8645,7 @@
                 <w:sz w:val="19"/>
                 <w:szCs w:val="19"/>
               </w:rPr>
-              <w:t xml:space="preserve">IMAGE-TO-VIDEO. Use the attached SINGLE-PERSON keyframe of the FEMALE doctor as the exact first frame (she is seated at the desk, turned about 90 degrees toward the empty patient chair, Japanese corner-seating layout). Animate ONLY this doctor speaking; keep the composition and 90-degree seating identical to the frame.</w:t>
+              <w:t xml:space="preserve">IMAGE-TO-VIDEO. Use the attached SINGLE-PERSON keyframe of the FEMALE doctor as the exact first frame (she is on the LEFT, seated on the chair with a backrest, turned about 90 degrees toward the empty patient stool on the right, Japanese corner-seating layout). Animate ONLY this doctor speaking; keep the composition and 90-degree seating identical to the frame.</w:t>
             </w:r>
           </w:p>
           <w:p>
@@ -8949,7 +8931,7 @@
                 <w:sz w:val="19"/>
                 <w:szCs w:val="19"/>
               </w:rPr>
-              <w:t xml:space="preserve">IMAGE-TO-VIDEO. Use the attached SINGLE-PERSON keyframe of the patient as the exact first frame (he is seated in the corner chair, turned about 90 degrees toward the empty doctor's stool, Japanese corner-seating layout). Animate ONLY this patient speaking; keep the composition and 90-degree seating identical to the frame.</w:t>
+              <w:t xml:space="preserve">IMAGE-TO-VIDEO. Use the attached SINGLE-PERSON keyframe of the patient as the exact first frame (he is on the RIGHT, seated on the round stool, turned about 90 degrees toward the empty doctor's backrest chair on the left, Japanese corner-seating layout). Animate ONLY this patient speaking; keep the composition and 90-degree seating identical to the frame.</w:t>
             </w:r>
           </w:p>
           <w:p>
@@ -9230,7 +9212,7 @@
                 <w:sz w:val="19"/>
                 <w:szCs w:val="19"/>
               </w:rPr>
-              <w:t xml:space="preserve">IMAGE-TO-VIDEO. Use the attached SINGLE-PERSON keyframe of the FEMALE doctor as the exact first frame (she is seated at the desk, turned about 90 degrees toward the empty patient chair, Japanese corner-seating layout). Animate ONLY this doctor speaking; keep the composition and 90-degree seating identical to the frame.</w:t>
+              <w:t xml:space="preserve">IMAGE-TO-VIDEO. Use the attached SINGLE-PERSON keyframe of the FEMALE doctor as the exact first frame (she is on the LEFT, seated on the chair with a backrest, turned about 90 degrees toward the empty patient stool on the right, Japanese corner-seating layout). Animate ONLY this doctor speaking; keep the composition and 90-degree seating identical to the frame.</w:t>
             </w:r>
           </w:p>
           <w:p>
@@ -9511,7 +9493,7 @@
                 <w:sz w:val="19"/>
                 <w:szCs w:val="19"/>
               </w:rPr>
-              <w:t xml:space="preserve">IMAGE-TO-VIDEO. Use the attached SINGLE-PERSON keyframe of the patient as the exact first frame (he is seated in the corner chair, turned about 90 degrees toward the empty doctor's stool, Japanese corner-seating layout). Animate ONLY this patient speaking; keep the composition and 90-degree seating identical to the frame.</w:t>
+              <w:t xml:space="preserve">IMAGE-TO-VIDEO. Use the attached SINGLE-PERSON keyframe of the patient as the exact first frame (he is on the RIGHT, seated on the round stool, turned about 90 degrees toward the empty doctor's backrest chair on the left, Japanese corner-seating layout). Animate ONLY this patient speaking; keep the composition and 90-degree seating identical to the frame.</w:t>
             </w:r>
           </w:p>
           <w:p>
@@ -9792,7 +9774,7 @@
                 <w:sz w:val="19"/>
                 <w:szCs w:val="19"/>
               </w:rPr>
-              <w:t xml:space="preserve">IMAGE-TO-VIDEO. Use the attached SINGLE-PERSON keyframe of the FEMALE doctor as the exact first frame (she is seated at the desk, turned about 90 degrees toward the empty patient chair, Japanese corner-seating layout). Animate ONLY this doctor speaking; keep the composition and 90-degree seating identical to the frame.</w:t>
+              <w:t xml:space="preserve">IMAGE-TO-VIDEO. Use the attached SINGLE-PERSON keyframe of the FEMALE doctor as the exact first frame (she is on the LEFT, seated on the chair with a backrest, turned about 90 degrees toward the empty patient stool on the right, Japanese corner-seating layout). Animate ONLY this doctor speaking; keep the composition and 90-degree seating identical to the frame.</w:t>
             </w:r>
           </w:p>
           <w:p>
@@ -10078,7 +10060,7 @@
                 <w:sz w:val="19"/>
                 <w:szCs w:val="19"/>
               </w:rPr>
-              <w:t xml:space="preserve">IMAGE-TO-VIDEO. Use the attached SINGLE-PERSON keyframe of the FEMALE doctor as the exact first frame (she is seated at the desk, turned about 90 degrees toward the empty patient chair, Japanese corner-seating layout). Animate ONLY this doctor speaking; keep the composition and 90-degree seating identical to the frame.</w:t>
+              <w:t xml:space="preserve">IMAGE-TO-VIDEO. Use the attached SINGLE-PERSON keyframe of the FEMALE doctor as the exact first frame (she is on the LEFT, seated on the chair with a backrest, turned about 90 degrees toward the empty patient stool on the right, Japanese corner-seating layout). Animate ONLY this doctor speaking; keep the composition and 90-degree seating identical to the frame.</w:t>
             </w:r>
           </w:p>
           <w:p>
@@ -10575,7 +10557,7 @@
                 <w:sz w:val="19"/>
                 <w:szCs w:val="19"/>
               </w:rPr>
-              <w:t xml:space="preserve">IMAGE-TO-VIDEO. Use the attached SINGLE-PERSON keyframe of the patient as the exact first frame (he is seated in the corner chair, turned about 90 degrees toward the empty doctor's stool, Japanese corner-seating layout). Animate ONLY this patient speaking; keep the composition and 90-degree seating identical to the frame.</w:t>
+              <w:t xml:space="preserve">IMAGE-TO-VIDEO. Use the attached SINGLE-PERSON keyframe of the patient as the exact first frame (he is on the RIGHT, seated on the round stool, turned about 90 degrees toward the empty doctor's backrest chair on the left, Japanese corner-seating layout). Animate ONLY this patient speaking; keep the composition and 90-degree seating identical to the frame.</w:t>
             </w:r>
           </w:p>
           <w:p>
@@ -10856,7 +10838,7 @@
                 <w:sz w:val="19"/>
                 <w:szCs w:val="19"/>
               </w:rPr>
-              <w:t xml:space="preserve">IMAGE-TO-VIDEO. Use the attached SINGLE-PERSON keyframe of the FEMALE doctor as the exact first frame (she is seated at the desk, turned about 90 degrees toward the empty patient chair, Japanese corner-seating layout). Animate ONLY this doctor speaking; keep the composition and 90-degree seating identical to the frame.</w:t>
+              <w:t xml:space="preserve">IMAGE-TO-VIDEO. Use the attached SINGLE-PERSON keyframe of the FEMALE doctor as the exact first frame (she is on the LEFT, seated on the chair with a backrest, turned about 90 degrees toward the empty patient stool on the right, Japanese corner-seating layout). Animate ONLY this doctor speaking; keep the composition and 90-degree seating identical to the frame.</w:t>
             </w:r>
           </w:p>
           <w:p>
@@ -11142,7 +11124,7 @@
                 <w:sz w:val="19"/>
                 <w:szCs w:val="19"/>
               </w:rPr>
-              <w:t xml:space="preserve">IMAGE-TO-VIDEO. Use the attached SINGLE-PERSON keyframe of the FEMALE doctor as the exact first frame (she is seated at the desk, turned about 90 degrees toward the empty patient chair, Japanese corner-seating layout). Animate ONLY this doctor speaking; keep the composition and 90-degree seating identical to the frame.</w:t>
+              <w:t xml:space="preserve">IMAGE-TO-VIDEO. Use the attached SINGLE-PERSON keyframe of the FEMALE doctor as the exact first frame (she is on the LEFT, seated on the chair with a backrest, turned about 90 degrees toward the empty patient stool on the right, Japanese corner-seating layout). Animate ONLY this doctor speaking; keep the composition and 90-degree seating identical to the frame.</w:t>
             </w:r>
           </w:p>
           <w:p>
@@ -11423,7 +11405,7 @@
                 <w:sz w:val="19"/>
                 <w:szCs w:val="19"/>
               </w:rPr>
-              <w:t xml:space="preserve">IMAGE-TO-VIDEO. Use the attached SINGLE-PERSON keyframe of the patient as the exact first frame (he is seated in the corner chair, turned about 90 degrees toward the empty doctor's stool, Japanese corner-seating layout). Animate ONLY this patient speaking; keep the composition and 90-degree seating identical to the frame.</w:t>
+              <w:t xml:space="preserve">IMAGE-TO-VIDEO. Use the attached SINGLE-PERSON keyframe of the patient as the exact first frame (he is on the RIGHT, seated on the round stool, turned about 90 degrees toward the empty doctor's backrest chair on the left, Japanese corner-seating layout). Animate ONLY this patient speaking; keep the composition and 90-degree seating identical to the frame.</w:t>
             </w:r>
           </w:p>
           <w:p>
@@ -11704,7 +11686,7 @@
                 <w:sz w:val="19"/>
                 <w:szCs w:val="19"/>
               </w:rPr>
-              <w:t xml:space="preserve">IMAGE-TO-VIDEO. Use the attached SINGLE-PERSON keyframe of the FEMALE doctor as the exact first frame (she is seated at the desk, turned about 90 degrees toward the empty patient chair, Japanese corner-seating layout). Animate ONLY this doctor speaking; keep the composition and 90-degree seating identical to the frame.</w:t>
+              <w:t xml:space="preserve">IMAGE-TO-VIDEO. Use the attached SINGLE-PERSON keyframe of the FEMALE doctor as the exact first frame (she is on the LEFT, seated on the chair with a backrest, turned about 90 degrees toward the empty patient stool on the right, Japanese corner-seating layout). Animate ONLY this doctor speaking; keep the composition and 90-degree seating identical to the frame.</w:t>
             </w:r>
           </w:p>
           <w:p>
@@ -11985,7 +11967,7 @@
                 <w:sz w:val="19"/>
                 <w:szCs w:val="19"/>
               </w:rPr>
-              <w:t xml:space="preserve">IMAGE-TO-VIDEO. Use the attached SINGLE-PERSON keyframe of the patient as the exact first frame (he is seated in the corner chair, turned about 90 degrees toward the empty doctor's stool, Japanese corner-seating layout). Animate ONLY this patient speaking; keep the composition and 90-degree seating identical to the frame.</w:t>
+              <w:t xml:space="preserve">IMAGE-TO-VIDEO. Use the attached SINGLE-PERSON keyframe of the patient as the exact first frame (he is on the RIGHT, seated on the round stool, turned about 90 degrees toward the empty doctor's backrest chair on the left, Japanese corner-seating layout). Animate ONLY this patient speaking; keep the composition and 90-degree seating identical to the frame.</w:t>
             </w:r>
           </w:p>
           <w:p>
@@ -12271,7 +12253,7 @@
                 <w:sz w:val="19"/>
                 <w:szCs w:val="19"/>
               </w:rPr>
-              <w:t xml:space="preserve">IMAGE-TO-VIDEO. Use the attached SINGLE-PERSON keyframe of the FEMALE doctor as the exact first frame (she is seated at the desk, turned about 90 degrees toward the empty patient chair, Japanese corner-seating layout). Animate ONLY this doctor speaking; keep the composition and 90-degree seating identical to the frame.</w:t>
+              <w:t xml:space="preserve">IMAGE-TO-VIDEO. Use the attached SINGLE-PERSON keyframe of the FEMALE doctor as the exact first frame (she is on the LEFT, seated on the chair with a backrest, turned about 90 degrees toward the empty patient stool on the right, Japanese corner-seating layout). Animate ONLY this doctor speaking; keep the composition and 90-degree seating identical to the frame.</w:t>
             </w:r>
           </w:p>
           <w:p>
@@ -12552,7 +12534,7 @@
                 <w:sz w:val="19"/>
                 <w:szCs w:val="19"/>
               </w:rPr>
-              <w:t xml:space="preserve">IMAGE-TO-VIDEO. Use the attached SINGLE-PERSON keyframe of the FEMALE doctor as the exact first frame (she is seated at the desk, turned about 90 degrees toward the empty patient chair, Japanese corner-seating layout). Animate ONLY this doctor speaking; keep the composition and 90-degree seating identical to the frame.</w:t>
+              <w:t xml:space="preserve">IMAGE-TO-VIDEO. Use the attached SINGLE-PERSON keyframe of the FEMALE doctor as the exact first frame (she is on the LEFT, seated on the chair with a backrest, turned about 90 degrees toward the empty patient stool on the right, Japanese corner-seating layout). Animate ONLY this doctor speaking; keep the composition and 90-degree seating identical to the frame.</w:t>
             </w:r>
           </w:p>
           <w:p>
@@ -12833,7 +12815,7 @@
                 <w:sz w:val="19"/>
                 <w:szCs w:val="19"/>
               </w:rPr>
-              <w:t xml:space="preserve">IMAGE-TO-VIDEO. Use the attached SINGLE-PERSON keyframe of the patient as the exact first frame (he is seated in the corner chair, turned about 90 degrees toward the empty doctor's stool, Japanese corner-seating layout). Animate ONLY this patient speaking; keep the composition and 90-degree seating identical to the frame.</w:t>
+              <w:t xml:space="preserve">IMAGE-TO-VIDEO. Use the attached SINGLE-PERSON keyframe of the patient as the exact first frame (he is on the RIGHT, seated on the round stool, turned about 90 degrees toward the empty doctor's backrest chair on the left, Japanese corner-seating layout). Animate ONLY this patient speaking; keep the composition and 90-degree seating identical to the frame.</w:t>
             </w:r>
           </w:p>
           <w:p>
@@ -13114,7 +13096,7 @@
                 <w:sz w:val="19"/>
                 <w:szCs w:val="19"/>
               </w:rPr>
-              <w:t xml:space="preserve">IMAGE-TO-VIDEO. Use the attached SINGLE-PERSON keyframe of the FEMALE doctor as the exact first frame (she is seated at the desk, turned about 90 degrees toward the empty patient chair, Japanese corner-seating layout). Animate ONLY this doctor speaking; keep the composition and 90-degree seating identical to the frame.</w:t>
+              <w:t xml:space="preserve">IMAGE-TO-VIDEO. Use the attached SINGLE-PERSON keyframe of the FEMALE doctor as the exact first frame (she is on the LEFT, seated on the chair with a backrest, turned about 90 degrees toward the empty patient stool on the right, Japanese corner-seating layout). Animate ONLY this doctor speaking; keep the composition and 90-degree seating identical to the frame.</w:t>
             </w:r>
           </w:p>
           <w:p>
@@ -13400,7 +13382,7 @@
                 <w:sz w:val="19"/>
                 <w:szCs w:val="19"/>
               </w:rPr>
-              <w:t xml:space="preserve">IMAGE-TO-VIDEO. Use the attached SINGLE-PERSON keyframe of the patient as the exact first frame (he is seated in the corner chair, turned about 90 degrees toward the empty doctor's stool, Japanese corner-seating layout). Animate ONLY this patient speaking; keep the composition and 90-degree seating identical to the frame.</w:t>
+              <w:t xml:space="preserve">IMAGE-TO-VIDEO. Use the attached SINGLE-PERSON keyframe of the patient as the exact first frame (he is on the RIGHT, seated on the round stool, turned about 90 degrees toward the empty doctor's backrest chair on the left, Japanese corner-seating layout). Animate ONLY this patient speaking; keep the composition and 90-degree seating identical to the frame.</w:t>
             </w:r>
           </w:p>
           <w:p>
@@ -13681,7 +13663,7 @@
                 <w:sz w:val="19"/>
                 <w:szCs w:val="19"/>
               </w:rPr>
-              <w:t xml:space="preserve">IMAGE-TO-VIDEO. Use the attached SINGLE-PERSON keyframe of the FEMALE doctor as the exact first frame (she is seated at the desk, turned about 90 degrees toward the empty patient chair, Japanese corner-seating layout). Animate ONLY this doctor speaking; keep the composition and 90-degree seating identical to the frame.</w:t>
+              <w:t xml:space="preserve">IMAGE-TO-VIDEO. Use the attached SINGLE-PERSON keyframe of the FEMALE doctor as the exact first frame (she is on the LEFT, seated on the chair with a backrest, turned about 90 degrees toward the empty patient stool on the right, Japanese corner-seating layout). Animate ONLY this doctor speaking; keep the composition and 90-degree seating identical to the frame.</w:t>
             </w:r>
           </w:p>
           <w:p>
@@ -13962,7 +13944,7 @@
                 <w:sz w:val="19"/>
                 <w:szCs w:val="19"/>
               </w:rPr>
-              <w:t xml:space="preserve">IMAGE-TO-VIDEO. Use the attached SINGLE-PERSON keyframe of the patient as the exact first frame (he is seated in the corner chair, turned about 90 degrees toward the empty doctor's stool, Japanese corner-seating layout). Animate ONLY this patient speaking; keep the composition and 90-degree seating identical to the frame.</w:t>
+              <w:t xml:space="preserve">IMAGE-TO-VIDEO. Use the attached SINGLE-PERSON keyframe of the patient as the exact first frame (he is on the RIGHT, seated on the round stool, turned about 90 degrees toward the empty doctor's backrest chair on the left, Japanese corner-seating layout). Animate ONLY this patient speaking; keep the composition and 90-degree seating identical to the frame.</w:t>
             </w:r>
           </w:p>
           <w:p>
@@ -14243,7 +14225,7 @@
                 <w:sz w:val="19"/>
                 <w:szCs w:val="19"/>
               </w:rPr>
-              <w:t xml:space="preserve">IMAGE-TO-VIDEO. Use the attached TWO-PERSON keyframe (female doctor on the LEFT at the desk, Vietnamese male patient on the RIGHT in the corner chair, seated at 90 degrees at the corner of the desk, both faces already correct) as the exact first frame. Animate both, keeping BOTH faces and the 90-degree Japanese seating identical to the frame.</w:t>
+              <w:t xml:space="preserve">IMAGE-TO-VIDEO. Use the attached TWO-PERSON keyframe (female doctor on the LEFT on the chair with a backrest, Vietnamese male patient on the RIGHT on the round stool, seated at 90 degrees at the corner of the desk, both faces already correct) as the exact first frame. Animate both, keeping BOTH faces and the 90-degree Japanese seating identical to the frame.</w:t>
             </w:r>
           </w:p>
           <w:p>

</xml_diff>